<commit_message>
final formats for submission
</commit_message>
<xml_diff>
--- a/_tables/tbl-consort-checklist.docx
+++ b/_tables/tbl-consort-checklist.docx
@@ -382,7 +382,7 @@
                 <w:rFonts w:ascii="Calibri" w:hAnsi="Calibri"/>
                 <w:sz w:val="20"/>
               </w:rPr>
-              <w:t xml:space="default">p. 1; p. 3</w:t>
+              <w:t xml:space="default">p. 1; p. 2</w:t>
             </w:r>
           </w:p>
         </w:tc>
@@ -507,7 +507,7 @@
                 <w:rFonts w:ascii="Calibri" w:hAnsi="Calibri"/>
                 <w:sz w:val="20"/>
               </w:rPr>
-              <w:t xml:space="default">p. 3-4</w:t>
+              <w:t xml:space="default">p. 2-3</w:t>
             </w:r>
           </w:p>
         </w:tc>
@@ -762,7 +762,7 @@
                 <w:rFonts w:ascii="Calibri" w:hAnsi="Calibri"/>
                 <w:sz w:val="20"/>
               </w:rPr>
-              <w:t xml:space="default">p. 4; p. 8</w:t>
+              <w:t xml:space="default">p. 7</w:t>
             </w:r>
           </w:p>
         </w:tc>
@@ -887,7 +887,7 @@
                 <w:rFonts w:ascii="Calibri" w:hAnsi="Calibri"/>
                 <w:sz w:val="20"/>
               </w:rPr>
-              <w:t xml:space="default">p. 8 (trial protocol); p. 10 (SAP)</w:t>
+              <w:t xml:space="default">p. 7 (trial protocol); p. 9 (SAP)</w:t>
             </w:r>
           </w:p>
         </w:tc>
@@ -1012,7 +1012,7 @@
                 <w:rFonts w:ascii="Calibri" w:hAnsi="Calibri"/>
                 <w:sz w:val="20"/>
               </w:rPr>
-              <w:t xml:space="default">p. 19</w:t>
+              <w:t xml:space="default">p. 18</w:t>
             </w:r>
           </w:p>
         </w:tc>
@@ -1137,7 +1137,7 @@
                 <w:rFonts w:ascii="Calibri" w:hAnsi="Calibri"/>
                 <w:sz w:val="20"/>
               </w:rPr>
-              <w:t xml:space="default">p. 4; p. 19</w:t>
+              <w:t xml:space="default">p. 3; p. 18</w:t>
             </w:r>
           </w:p>
         </w:tc>
@@ -1262,7 +1262,7 @@
                 <w:rFonts w:ascii="Calibri" w:hAnsi="Calibri"/>
                 <w:sz w:val="20"/>
               </w:rPr>
-              <w:t xml:space="default">p. 19</w:t>
+              <w:t xml:space="default">p. 18</w:t>
             </w:r>
           </w:p>
         </w:tc>
@@ -1517,7 +1517,7 @@
                 <w:rFonts w:ascii="Calibri" w:hAnsi="Calibri"/>
                 <w:sz w:val="20"/>
               </w:rPr>
-              <w:t xml:space="default">p. 7</w:t>
+              <w:t xml:space="default">p. 6</w:t>
             </w:r>
           </w:p>
         </w:tc>
@@ -1642,7 +1642,7 @@
                 <w:rFonts w:ascii="Calibri" w:hAnsi="Calibri"/>
                 <w:sz w:val="20"/>
               </w:rPr>
-              <w:t xml:space="default">p. 8</w:t>
+              <w:t xml:space="default">p. 7</w:t>
             </w:r>
           </w:p>
         </w:tc>
@@ -1897,7 +1897,7 @@
                 <w:rFonts w:ascii="Calibri" w:hAnsi="Calibri"/>
                 <w:sz w:val="20"/>
               </w:rPr>
-              <w:t xml:space="default">p. 8</w:t>
+              <w:t xml:space="default">p. 7</w:t>
             </w:r>
           </w:p>
         </w:tc>
@@ -2022,7 +2022,7 @@
                 <w:rFonts w:ascii="Calibri" w:hAnsi="Calibri"/>
                 <w:sz w:val="20"/>
               </w:rPr>
-              <w:t xml:space="default">p. 8</w:t>
+              <w:t xml:space="default">p. 7</w:t>
             </w:r>
           </w:p>
         </w:tc>
@@ -2147,7 +2147,7 @@
                 <w:rFonts w:ascii="Calibri" w:hAnsi="Calibri"/>
                 <w:sz w:val="20"/>
               </w:rPr>
-              <w:t xml:space="default">p. 10</w:t>
+              <w:t xml:space="default">not applicable</w:t>
             </w:r>
           </w:p>
         </w:tc>
@@ -2272,7 +2272,7 @@
                 <w:rFonts w:ascii="Calibri" w:hAnsi="Calibri"/>
                 <w:sz w:val="20"/>
               </w:rPr>
-              <w:t xml:space="default">p. 8</w:t>
+              <w:t xml:space="default">p. 7</w:t>
             </w:r>
           </w:p>
         </w:tc>
@@ -2397,7 +2397,7 @@
                 <w:rFonts w:ascii="Calibri" w:hAnsi="Calibri"/>
                 <w:sz w:val="20"/>
               </w:rPr>
-              <w:t xml:space="default">p. 8</w:t>
+              <w:t xml:space="default">p. 7</w:t>
             </w:r>
           </w:p>
         </w:tc>
@@ -2647,7 +2647,7 @@
                 <w:rFonts w:ascii="Calibri" w:hAnsi="Calibri"/>
                 <w:sz w:val="20"/>
               </w:rPr>
-              <w:t xml:space="default">p. 9</w:t>
+              <w:t xml:space="default">p. 8-9; table 1 and figure 1</w:t>
             </w:r>
           </w:p>
         </w:tc>
@@ -2772,7 +2772,7 @@
                 <w:rFonts w:ascii="Calibri" w:hAnsi="Calibri"/>
                 <w:sz w:val="20"/>
               </w:rPr>
-              <w:t xml:space="default">p. 10-11; table 2</w:t>
+              <w:t xml:space="default">p. 9-10; table 2</w:t>
             </w:r>
           </w:p>
         </w:tc>
@@ -2897,7 +2897,7 @@
                 <w:rFonts w:ascii="Calibri" w:hAnsi="Calibri"/>
                 <w:sz w:val="20"/>
               </w:rPr>
-              <w:t xml:space="default">p. 11</w:t>
+              <w:t xml:space="default">p. 10</w:t>
             </w:r>
           </w:p>
         </w:tc>
@@ -3022,7 +3022,7 @@
                 <w:rFonts w:ascii="Calibri" w:hAnsi="Calibri"/>
                 <w:sz w:val="20"/>
               </w:rPr>
-              <w:t xml:space="default">p. 11</w:t>
+              <w:t xml:space="default">p. 10</w:t>
             </w:r>
           </w:p>
         </w:tc>
@@ -3147,7 +3147,7 @@
                 <w:rFonts w:ascii="Calibri" w:hAnsi="Calibri"/>
                 <w:sz w:val="20"/>
               </w:rPr>
-              <w:t xml:space="default">p. 13</w:t>
+              <w:t xml:space="default">p. 12</w:t>
             </w:r>
           </w:p>
         </w:tc>
@@ -3402,7 +3402,7 @@
                 <w:rFonts w:ascii="Calibri" w:hAnsi="Calibri"/>
                 <w:sz w:val="20"/>
               </w:rPr>
-              <w:t xml:space="default">p. 9</w:t>
+              <w:t xml:space="default">p. 8</w:t>
             </w:r>
           </w:p>
         </w:tc>
@@ -3527,7 +3527,7 @@
                 <w:rFonts w:ascii="Calibri" w:hAnsi="Calibri"/>
                 <w:sz w:val="20"/>
               </w:rPr>
-              <w:t xml:space="default">p. 9</w:t>
+              <w:t xml:space="default">p. 8</w:t>
             </w:r>
           </w:p>
         </w:tc>
@@ -3652,7 +3652,7 @@
                 <w:rFonts w:ascii="Calibri" w:hAnsi="Calibri"/>
                 <w:sz w:val="20"/>
               </w:rPr>
-              <w:t xml:space="default">p. 9</w:t>
+              <w:t xml:space="default">p. 8</w:t>
             </w:r>
           </w:p>
         </w:tc>
@@ -3777,7 +3777,7 @@
                 <w:rFonts w:ascii="Calibri" w:hAnsi="Calibri"/>
                 <w:sz w:val="20"/>
               </w:rPr>
-              <w:t xml:space="default">p. 9</w:t>
+              <w:t xml:space="default">p. 8</w:t>
             </w:r>
           </w:p>
         </w:tc>
@@ -3902,7 +3902,7 @@
                 <w:rFonts w:ascii="Calibri" w:hAnsi="Calibri"/>
                 <w:sz w:val="20"/>
               </w:rPr>
-              <w:t xml:space="default">p. 9</w:t>
+              <w:t xml:space="default">p. 8</w:t>
             </w:r>
           </w:p>
         </w:tc>
@@ -4027,7 +4027,7 @@
                 <w:rFonts w:ascii="Calibri" w:hAnsi="Calibri"/>
                 <w:sz w:val="20"/>
               </w:rPr>
-              <w:t xml:space="default">p. 9</w:t>
+              <w:t xml:space="default">p. 8</w:t>
             </w:r>
           </w:p>
         </w:tc>
@@ -4152,7 +4152,7 @@
                 <w:rFonts w:ascii="Calibri" w:hAnsi="Calibri"/>
                 <w:sz w:val="20"/>
               </w:rPr>
-              <w:t xml:space="default">p. 11</w:t>
+              <w:t xml:space="default">p. 10-12</w:t>
             </w:r>
           </w:p>
         </w:tc>
@@ -4277,7 +4277,7 @@
                 <w:rFonts w:ascii="Calibri" w:hAnsi="Calibri"/>
                 <w:sz w:val="20"/>
               </w:rPr>
-              <w:t xml:space="default">p. 11-12</w:t>
+              <w:t xml:space="default">p. 10-12</w:t>
             </w:r>
           </w:p>
         </w:tc>
@@ -4402,7 +4402,7 @@
                 <w:rFonts w:ascii="Calibri" w:hAnsi="Calibri"/>
                 <w:sz w:val="20"/>
               </w:rPr>
-              <w:t xml:space="default">p. 11-12</w:t>
+              <w:t xml:space="default">p. 10-12</w:t>
             </w:r>
           </w:p>
         </w:tc>
@@ -4527,7 +4527,7 @@
                 <w:rFonts w:ascii="Calibri" w:hAnsi="Calibri"/>
                 <w:sz w:val="20"/>
               </w:rPr>
-              <w:t xml:space="default">p. 11-12</w:t>
+              <w:t xml:space="default">p. 11</w:t>
             </w:r>
           </w:p>
         </w:tc>
@@ -4782,7 +4782,7 @@
                 <w:rFonts w:ascii="Calibri" w:hAnsi="Calibri"/>
                 <w:sz w:val="20"/>
               </w:rPr>
-              <w:t xml:space="default">p. 9; Figure 1</w:t>
+              <w:t xml:space="default">Figure 2</w:t>
             </w:r>
           </w:p>
         </w:tc>
@@ -4907,7 +4907,7 @@
                 <w:rFonts w:ascii="Calibri" w:hAnsi="Calibri"/>
                 <w:sz w:val="20"/>
               </w:rPr>
-              <w:t xml:space="default">Figure 1</w:t>
+              <w:t xml:space="default">Figure 2</w:t>
             </w:r>
           </w:p>
         </w:tc>
@@ -5032,7 +5032,7 @@
                 <w:rFonts w:ascii="Calibri" w:hAnsi="Calibri"/>
                 <w:sz w:val="20"/>
               </w:rPr>
-              <w:t xml:space="default">p. 13</w:t>
+              <w:t xml:space="default">p. 12</w:t>
             </w:r>
           </w:p>
         </w:tc>
@@ -5157,7 +5157,7 @@
                 <w:rFonts w:ascii="Calibri" w:hAnsi="Calibri"/>
                 <w:sz w:val="20"/>
               </w:rPr>
-              <w:t xml:space="default">p. 13</w:t>
+              <w:t xml:space="default">p. 12</w:t>
             </w:r>
           </w:p>
         </w:tc>
@@ -5282,7 +5282,7 @@
                 <w:rFonts w:ascii="Calibri" w:hAnsi="Calibri"/>
                 <w:sz w:val="20"/>
               </w:rPr>
-              <w:t xml:space="default">Figure 1</w:t>
+              <w:t xml:space="default">Figure 2</w:t>
             </w:r>
           </w:p>
         </w:tc>
@@ -5657,7 +5657,7 @@
                 <w:rFonts w:ascii="Calibri" w:hAnsi="Calibri"/>
                 <w:sz w:val="20"/>
               </w:rPr>
-              <w:t xml:space="default">p. 14; table 4, table 5, and table 6.</w:t>
+              <w:t xml:space="default">p. 13-14; table 4-7</w:t>
             </w:r>
           </w:p>
         </w:tc>
@@ -5782,7 +5782,7 @@
                 <w:rFonts w:ascii="Calibri" w:hAnsi="Calibri"/>
                 <w:sz w:val="20"/>
               </w:rPr>
-              <w:t xml:space="default">p. 15; Table 7</w:t>
+              <w:t xml:space="default">p. 14; Table 8</w:t>
             </w:r>
           </w:p>
         </w:tc>
@@ -5907,7 +5907,7 @@
                 <w:rFonts w:ascii="Calibri" w:hAnsi="Calibri"/>
                 <w:sz w:val="20"/>
               </w:rPr>
-              <w:t xml:space="default">p. 15-16</w:t>
+              <w:t xml:space="default">p. 15</w:t>
             </w:r>
           </w:p>
         </w:tc>
@@ -6287,7 +6287,7 @@
                 <w:rFonts w:ascii="Calibri" w:hAnsi="Calibri"/>
                 <w:sz w:val="20"/>
               </w:rPr>
-              <w:t xml:space="default">p. 17-18</w:t>
+              <w:t xml:space="default">p. 17</w:t>
             </w:r>
           </w:p>
         </w:tc>

</xml_diff>